<commit_message>
fix(con-base): ajuste de dimensiones landscape, margenes oficiales, curriculo estructurado y validador de tildes
</commit_message>
<xml_diff>
--- a/muestras_word/Muestra_CON_BASE_Multigrado_1erCiclo.docx
+++ b/muestras_word/Muestra_CON_BASE_Multigrado_1erCiclo.docx
@@ -320,7 +320,7 @@
                 <w:sz w:val="18"/>
                 <w:szCs w:val="18"/>
               </w:rPr>
-              <w:t xml:space="preserve">Secuencia 1: Secuencia 1: Tarjeta de identidad / Documento de identidad / Autobiografía</w:t>
+              <w:t xml:space="preserve">Secuencia 1: Tarjeta de identidad / Documento de identidad / Autobiografía</w:t>
             </w:r>
           </w:p>
         </w:tc>
@@ -565,8 +565,7 @@
                 <w:sz w:val="18"/>
                 <w:szCs w:val="18"/>
               </w:rPr>
-              <w:t xml:space="preserve">Comunicativa.  Expresa y comprende, de forma oral y escrita en diferentes contextos,
-textos funcionales y literarios muy sencillos y de estructura sintáctica simple, mediante el uso de medios</w:t>
+              <w:t xml:space="preserve">Comunicativa: Expresa y comprende, de forma oral y escrita en diferentes contextos, textos funcionales y literarios muy sencillos y de estructura sintáctica simple, mediante el uso de medios y recursos apropiados, demostrando avance progresivo en sus procesos de lectura y escritura.</w:t>
             </w:r>
           </w:p>
           <w:p>
@@ -592,7 +591,7 @@
                 <w:sz w:val="18"/>
                 <w:szCs w:val="18"/>
               </w:rPr>
-              <w:t xml:space="preserve">Secuencia 1: Tarjeta de identidad / Documento de identidad / Autobiografia</w:t>
+              <w:t xml:space="preserve">La tarjeta de identidad: función y estructura (nombre y apellido)., Función del nombre propio.</w:t>
             </w:r>
           </w:p>
           <w:p>
@@ -618,7 +617,7 @@
                 <w:sz w:val="18"/>
                 <w:szCs w:val="18"/>
               </w:rPr>
-              <w:t xml:space="preserve">Escucha atenta y producción de textos guiados por el docente, Identificación y análisis de elementos textuales propios del grado</w:t>
+              <w:t xml:space="preserve">Identificación de palabras que riman con los nombres., Conteo de sílabas e identificación de la sílaba inicial y final de los nombres., Lectura y escritura de su nombre en la tarjeta de identidad, con revisión y corrección guiada.</w:t>
             </w:r>
           </w:p>
           <w:p>
@@ -644,7 +643,7 @@
                 <w:sz w:val="18"/>
                 <w:szCs w:val="18"/>
               </w:rPr>
-              <w:t xml:space="preserve">Interés y curiosidad en el trabajo colaborativo, Cuidado, orden y respeto hacia las opiniones de los compañeros</w:t>
+              <w:t xml:space="preserve">Reconocimiento de sus características propias y fortalecimiento de su identidad., Cuidado en la presentación, orden y limpieza en la elaboración de su tarjeta de identidad.</w:t>
             </w:r>
           </w:p>
           <w:p>
@@ -670,7 +669,7 @@
                 <w:sz w:val="18"/>
                 <w:szCs w:val="18"/>
               </w:rPr>
-              <w:t xml:space="preserve">Comunica sus ideas de forma oral y escrita de acuerdo con su nivel de avance.; Muestra respeto ante las opiniones de los demás en el trabajo escolar.</w:t>
+              <w:t xml:space="preserve">Comunica sus ideas de forma oral y escrita, de acuerdo con sus conocimientos mediante un tipo de texto.; Lee convencionalmente textos sencillos funcionales (tarjeta de identidad).; Muestra respeto ante las opiniones de los demás.; Expresa valores que lo identifican culturalmente, mediante textos sencillos que lee y escribe.</w:t>
             </w:r>
           </w:p>
           <w:p>
@@ -696,7 +695,7 @@
                 <w:sz w:val="18"/>
                 <w:szCs w:val="18"/>
               </w:rPr>
-              <w:t xml:space="preserve">Adecuación Curricular Nivel Primario (MINERD, 2023), pp. 63-64.</w:t>
+              <w:t xml:space="preserve">Adecuación Curricular Nivel Primario (MINERD, 2023), pp. 63-64. Guía Didáctica Multigrado Lengua Española, pág. 29.</w:t>
             </w:r>
           </w:p>
         </w:tc>
@@ -767,8 +766,7 @@
                 <w:sz w:val="18"/>
                 <w:szCs w:val="18"/>
               </w:rPr>
-              <w:t xml:space="preserve">Comunicativa. Expresa y comprende, de forma oral y escrita en diferentes contextos, textos
-funcionales y literarios muy sencillos y de estructura sintáctica simple, mediante el uso de medios y recursos</w:t>
+              <w:t xml:space="preserve">Comunicativa: Expresa y comprende, de forma oral y escrita en diferentes contextos, textos funcionales y literarios muy sencillos y de estructura sintáctica simple, mediante el uso de medios y recursos apropiados, demostrando avance progresivo en sus procesos de lectura y escritura.</w:t>
             </w:r>
           </w:p>
           <w:p>
@@ -794,7 +792,7 @@
                 <w:sz w:val="18"/>
                 <w:szCs w:val="18"/>
               </w:rPr>
-              <w:t xml:space="preserve">Secuencia 1: Tarjeta de identidad / Documento de identidad / Autobiografia</w:t>
+              <w:t xml:space="preserve">El documento de identidad: función y estructura (nombre y apellido, fecha y lugar de nacimiento).</w:t>
             </w:r>
           </w:p>
           <w:p>
@@ -820,7 +818,7 @@
                 <w:sz w:val="18"/>
                 <w:szCs w:val="18"/>
               </w:rPr>
-              <w:t xml:space="preserve">Escucha atenta y producción de textos guiados por el docente, Identificación y análisis de elementos textuales propios del grado</w:t>
+              <w:t xml:space="preserve">Socialización de la intención comunicativa de la lectura del documento de identidad que escucha., Diferenciación de nombres, apellidos, fecha y lugar de nacimiento en los documentos de identidad., Planificación, escritura del primer borrador, revisión y corrección de sus datos en su documento de identidad.</w:t>
             </w:r>
           </w:p>
           <w:p>
@@ -846,7 +844,7 @@
                 <w:sz w:val="18"/>
                 <w:szCs w:val="18"/>
               </w:rPr>
-              <w:t xml:space="preserve">Interés y curiosidad en el trabajo colaborativo, Cuidado, orden y respeto hacia las opiniones de los compañeros</w:t>
+              <w:t xml:space="preserve">Satisfacción al distinguir sus nombres y apellidos entre otros que escucha o lee., Satisfacción al explicar los datos personales contenidos en su documento de identidad.</w:t>
             </w:r>
           </w:p>
           <w:p>
@@ -872,7 +870,7 @@
                 <w:sz w:val="18"/>
                 <w:szCs w:val="18"/>
               </w:rPr>
-              <w:t xml:space="preserve">Comunica sus ideas de forma oral y escrita de acuerdo con su nivel de avance.; Muestra respeto ante las opiniones de los demás en el trabajo escolar.</w:t>
+              <w:t xml:space="preserve">Formula sus conocimientos sobre temas variados, utilizando un tipo de texto oral y escrito.; Lee textos funcionales de manera convencional.; Expresa sus ideas por escrito mediante un texto apropiado.; Expresa sus opiniones a través de textos orales y escritos de manera crítica y muestra respeto por las ajenas.</w:t>
             </w:r>
           </w:p>
           <w:p>
@@ -898,7 +896,7 @@
                 <w:sz w:val="18"/>
                 <w:szCs w:val="18"/>
               </w:rPr>
-              <w:t xml:space="preserve">Adecuación Curricular Nivel Primario (MINERD, 2023), pp. 75-77.</w:t>
+              <w:t xml:space="preserve">Adecuación Curricular Nivel Primario (MINERD, 2023), pp. 75-77. Guía Didáctica Multigrado Lengua Española, pág. 30.</w:t>
             </w:r>
           </w:p>
         </w:tc>
@@ -969,8 +967,7 @@
                 <w:sz w:val="18"/>
                 <w:szCs w:val="18"/>
               </w:rPr>
-              <w:t xml:space="preserve">Comunicativa. Expresa y comprende, de forma oral y escrita en diferentes contextos, textos
-funcionales y literarios muy sencillos y de estructura sintáctica simple, mediante el uso de medios y recursos</w:t>
+              <w:t xml:space="preserve">Comunicativa: Expresa y comprende, de forma oral y escrita en diferentes contextos, textos funcionales y literarios muy sencillos y de estructura sintáctica simple, mediante el uso de medios y recursos apropiados, demostrando avance progresivo en sus procesos de lectura y escritura.</w:t>
             </w:r>
           </w:p>
           <w:p>
@@ -996,7 +993,7 @@
                 <w:sz w:val="18"/>
                 <w:szCs w:val="18"/>
               </w:rPr>
-              <w:t xml:space="preserve">Secuencia 1: Tarjeta de identidad / Documento de identidad / Autobiografia</w:t>
+              <w:t xml:space="preserve">La autobiografía: función y estructura (introducción, desarrollo y conclusión)., Hechos organizados en secuencia temporal, verbos en pasado en primera persona, adverbios de tiempo y orden, adjetivos y conectores temporales.</w:t>
             </w:r>
           </w:p>
           <w:p>
@@ -1022,7 +1019,7 @@
                 <w:sz w:val="18"/>
                 <w:szCs w:val="18"/>
               </w:rPr>
-              <w:t xml:space="preserve">Escucha atenta y producción de textos guiados por el docente, Identificación y análisis de elementos textuales propios del grado</w:t>
+              <w:t xml:space="preserve">Escucha atenta y lectura en voz alta de autobiografías aplicando convenciones de lectura., Utilización de la estructura de la autobiografía y secuencia temporal para comprender y producir su contenido., Planificación, escritura del primer borrador, revisión y corrección de su autobiografía.</w:t>
             </w:r>
           </w:p>
           <w:p>
@@ -1048,7 +1045,7 @@
                 <w:sz w:val="18"/>
                 <w:szCs w:val="18"/>
               </w:rPr>
-              <w:t xml:space="preserve">Interés y curiosidad en el trabajo colaborativo, Cuidado, orden y respeto hacia las opiniones de los compañeros</w:t>
+              <w:t xml:space="preserve">Reflexión sobre los valores de las personas cuya autobiografía ha escuchado para incorporarlos a su vida., Disfrute y creatividad al relatar su autobiografía de forma oral y escrita.</w:t>
             </w:r>
           </w:p>
           <w:p>
@@ -1074,7 +1071,7 @@
                 <w:sz w:val="18"/>
                 <w:szCs w:val="18"/>
               </w:rPr>
-              <w:t xml:space="preserve">Comunica sus ideas de forma oral y escrita de acuerdo con su nivel de avance.; Muestra respeto ante las opiniones de los demás en el trabajo escolar.</w:t>
+              <w:t xml:space="preserve">Utiliza textos orales y escritos para comunicar sus ideas en variados contextos sociales.; Produce textos orales y escritos sobre temas y problemas sociales de su entorno local y nacional.; Formula opiniones críticas y creativas mediante textos variados, respetando las de sus interlocutores.</w:t>
             </w:r>
           </w:p>
           <w:p>
@@ -1100,7 +1097,7 @@
                 <w:sz w:val="18"/>
                 <w:szCs w:val="18"/>
               </w:rPr>
-              <w:t xml:space="preserve">Adecuación Curricular Nivel Primario (MINERD, 2023), pp. 90-93.</w:t>
+              <w:t xml:space="preserve">Adecuación Curricular Nivel Primario (MINERD, 2023), pp. 90-93. Guía Didáctica Multigrado Lengua Española, pág. 31.</w:t>
             </w:r>
           </w:p>
         </w:tc>
@@ -1709,7 +1706,7 @@
                 <w:sz w:val="18"/>
                 <w:szCs w:val="18"/>
               </w:rPr>
-              <w:t xml:space="preserve">15 min</w:t>
+              <w:t xml:space="preserve">A definir por el docente min</w:t>
             </w:r>
           </w:p>
         </w:tc>
@@ -1826,7 +1823,7 @@
                 <w:sz w:val="18"/>
                 <w:szCs w:val="18"/>
               </w:rPr>
-              <w:t xml:space="preserve">25 min</w:t>
+              <w:t xml:space="preserve">A definir por el docente min</w:t>
             </w:r>
           </w:p>
         </w:tc>
@@ -1943,7 +1940,7 @@
                 <w:sz w:val="18"/>
                 <w:szCs w:val="18"/>
               </w:rPr>
-              <w:t xml:space="preserve">25 min</w:t>
+              <w:t xml:space="preserve">A definir por el docente min</w:t>
             </w:r>
           </w:p>
         </w:tc>
@@ -2060,7 +2057,7 @@
                 <w:sz w:val="18"/>
                 <w:szCs w:val="18"/>
               </w:rPr>
-              <w:t xml:space="preserve">15 min</w:t>
+              <w:t xml:space="preserve">A definir por el docente min</w:t>
             </w:r>
           </w:p>
         </w:tc>
@@ -2390,6 +2387,29 @@
               <w:t xml:space="preserve">Completar ficha de documento de identidad reconociendo mayúsculas y fecha de nacimiento.</w:t>
             </w:r>
           </w:p>
+          <w:p>
+            <w:pPr>
+              <w:spacing w:after="40"/>
+            </w:pPr>
+            <w:r>
+              <w:rPr>
+                <w:rFonts w:ascii="Calibri" w:cs="Calibri" w:eastAsia="Calibri" w:hAnsi="Calibri"/>
+                <w:b/>
+                <w:bCs/>
+                <w:sz w:val="18"/>
+                <w:szCs w:val="18"/>
+              </w:rPr>
+              <w:t xml:space="preserve">• 3.º Grado: </w:t>
+            </w:r>
+            <w:r>
+              <w:rPr>
+                <w:rFonts w:ascii="Calibri" w:cs="Calibri" w:eastAsia="Calibri" w:hAnsi="Calibri"/>
+                <w:sz w:val="18"/>
+                <w:szCs w:val="18"/>
+              </w:rPr>
+              <w:t xml:space="preserve">Escritura de borrador de la autobiografía organizando introducción, desarrollo y conclusión.</w:t>
+            </w:r>
+          </w:p>
         </w:tc>
       </w:tr>
       <w:tr>
@@ -2424,14 +2444,14 @@
                 <w:sz w:val="16"/>
                 <w:szCs w:val="16"/>
               </w:rPr>
-              <w:t xml:space="preserve">Fuente de referencia: Guía Didáctica de Lengua Española Multigrado (MINERD/UNICEF, 2023), pág. 29.</w:t>
+              <w:t xml:space="preserve">Fuente de referencia: Guía Didáctica de Lengua Española Multigrado (MINERD / UNICEF, 2023), págs. 29-54.</w:t>
             </w:r>
           </w:p>
         </w:tc>
       </w:tr>
     </w:tbl>
     <w:sectPr>
-      <w:pgSz w:w="11906" w:h="16838" w:orient="landscape"/>
+      <w:pgSz w:w="16838" w:h="11906" w:orient="landscape"/>
       <w:pgMar w:top="1701" w:right="1417" w:bottom="1701" w:left="1417" w:header="708" w:footer="708" w:gutter="0"/>
       <w:pgNumType/>
       <w:docGrid w:linePitch="360"/>

</xml_diff>